<commit_message>
updated docu with figures
</commit_message>
<xml_diff>
--- a/gf_c1_solar_output_llm/docs/challenge1_documentation.docx
+++ b/gf_c1_solar_output_llm/docs/challenge1_documentation.docx
@@ -114,7 +114,35 @@
         <w:rPr>
           <w:szCs w:val="22"/>
         </w:rPr>
-        <w:t xml:space="preserve">, then wraps that prediction in an LLM-powered natural-language agent a solar farm developer could actually use. Concretely, the deliverable needs to: </w:t>
+        <w:t xml:space="preserve">, then wraps that prediction in an LLM-powered natural-language agent a solar farm developer could </w:t>
+      </w:r>
+      <w:proofErr w:type="gramStart"/>
+      <w:r>
+        <w:rPr>
+          <w:szCs w:val="22"/>
+        </w:rPr>
+        <w:t>actually use</w:t>
+      </w:r>
+      <w:proofErr w:type="gramEnd"/>
+      <w:r>
+        <w:rPr>
+          <w:szCs w:val="22"/>
+        </w:rPr>
+        <w:t xml:space="preserve">. Concretely, the </w:t>
+      </w:r>
+      <w:proofErr w:type="gramStart"/>
+      <w:r>
+        <w:rPr>
+          <w:szCs w:val="22"/>
+        </w:rPr>
+        <w:t>deliverable</w:t>
+      </w:r>
+      <w:proofErr w:type="gramEnd"/>
+      <w:r>
+        <w:rPr>
+          <w:szCs w:val="22"/>
+        </w:rPr>
+        <w:t xml:space="preserve"> needs to: </w:t>
       </w:r>
     </w:p>
     <w:p>
@@ -542,78 +570,76 @@
     <w:p>
       <w:pPr>
         <w:rPr>
+          <w:szCs w:val="22"/>
+        </w:rPr>
+      </w:pPr>
+      <w:r>
+        <w:rPr>
+          <w:noProof/>
           <w:color w:val="EE0000"/>
           <w:szCs w:val="22"/>
         </w:rPr>
-      </w:pPr>
-      <w:r>
-        <w:rPr>
-          <w:color w:val="EE0000"/>
-          <w:szCs w:val="22"/>
-        </w:rPr>
-        <w:t>//</w:t>
-      </w:r>
-      <w:r>
-        <w:rPr>
-          <w:color w:val="EE0000"/>
-          <w:szCs w:val="22"/>
-        </w:rPr>
-        <w:t xml:space="preserve"> </w:t>
-      </w:r>
-      <w:r>
-        <w:rPr>
-          <w:color w:val="EE0000"/>
-          <w:szCs w:val="22"/>
-        </w:rPr>
-        <w:t>i</w:t>
-      </w:r>
-      <w:r>
-        <w:rPr>
-          <w:color w:val="EE0000"/>
-          <w:szCs w:val="22"/>
-        </w:rPr>
-        <w:t>nsert</w:t>
-      </w:r>
-      <w:r>
-        <w:rPr>
-          <w:color w:val="EE0000"/>
-          <w:szCs w:val="22"/>
-        </w:rPr>
-        <w:t xml:space="preserve"> system</w:t>
-      </w:r>
-      <w:r>
-        <w:rPr>
-          <w:color w:val="EE0000"/>
-          <w:szCs w:val="22"/>
-        </w:rPr>
-        <w:t xml:space="preserve"> diagram</w:t>
+        <w:lastRenderedPageBreak/>
+        <w:drawing>
+          <wp:inline distT="0" distB="0" distL="0" distR="0" wp14:anchorId="43A261E2" wp14:editId="59D9EC57">
+            <wp:extent cx="5513070" cy="1331534"/>
+            <wp:effectExtent l="0" t="0" r="0" b="2540"/>
+            <wp:docPr id="827651495" name="Picture 1"/>
+            <wp:cNvGraphicFramePr>
+              <a:graphicFrameLocks xmlns:a="http://schemas.openxmlformats.org/drawingml/2006/main" noChangeAspect="1"/>
+            </wp:cNvGraphicFramePr>
+            <a:graphic xmlns:a="http://schemas.openxmlformats.org/drawingml/2006/main">
+              <a:graphicData uri="http://schemas.openxmlformats.org/drawingml/2006/picture">
+                <pic:pic xmlns:pic="http://schemas.openxmlformats.org/drawingml/2006/picture">
+                  <pic:nvPicPr>
+                    <pic:cNvPr id="0" name="Picture 2"/>
+                    <pic:cNvPicPr>
+                      <a:picLocks noChangeAspect="1" noChangeArrowheads="1"/>
+                    </pic:cNvPicPr>
+                  </pic:nvPicPr>
+                  <pic:blipFill>
+                    <a:blip r:embed="rId6" cstate="print">
+                      <a:extLst>
+                        <a:ext uri="{28A0092B-C50C-407E-A947-70E740481C1C}">
+                          <a14:useLocalDpi xmlns:a14="http://schemas.microsoft.com/office/drawing/2010/main" val="0"/>
+                        </a:ext>
+                      </a:extLst>
+                    </a:blip>
+                    <a:srcRect/>
+                    <a:stretch>
+                      <a:fillRect/>
+                    </a:stretch>
+                  </pic:blipFill>
+                  <pic:spPr bwMode="auto">
+                    <a:xfrm>
+                      <a:off x="0" y="0"/>
+                      <a:ext cx="5543242" cy="1338821"/>
+                    </a:xfrm>
+                    <a:prstGeom prst="rect">
+                      <a:avLst/>
+                    </a:prstGeom>
+                    <a:noFill/>
+                  </pic:spPr>
+                </pic:pic>
+              </a:graphicData>
+            </a:graphic>
+          </wp:inline>
+        </w:drawing>
       </w:r>
     </w:p>
     <w:p>
       <w:pPr>
         <w:rPr>
-          <w:szCs w:val="22"/>
-        </w:rPr>
-      </w:pPr>
-    </w:p>
-    <w:p>
-      <w:pPr>
-        <w:rPr>
-          <w:szCs w:val="22"/>
-        </w:rPr>
-      </w:pPr>
-    </w:p>
-    <w:p>
-      <w:pPr>
-        <w:rPr>
-          <w:szCs w:val="22"/>
+          <w:sz w:val="20"/>
+          <w:szCs w:val="20"/>
         </w:rPr>
       </w:pPr>
       <w:r>
         <w:rPr>
           <w:i/>
           <w:iCs/>
-          <w:szCs w:val="22"/>
+          <w:sz w:val="20"/>
+          <w:szCs w:val="20"/>
         </w:rPr>
         <w:t>Natural-language questions in → grounded, numeric answers out.</w:t>
       </w:r>
@@ -769,7 +795,35 @@
         <w:rPr>
           <w:szCs w:val="22"/>
         </w:rPr>
-        <w:t>issing weather values are imputed using each city's own mean (not a global mean), to preserve city-to-city variation rather than smoothing it away.</w:t>
+        <w:t xml:space="preserve">issing weather values are imputed using each city's own </w:t>
+      </w:r>
+      <w:proofErr w:type="gramStart"/>
+      <w:r>
+        <w:rPr>
+          <w:szCs w:val="22"/>
+        </w:rPr>
+        <w:t>mean</w:t>
+      </w:r>
+      <w:proofErr w:type="gramEnd"/>
+      <w:r>
+        <w:rPr>
+          <w:szCs w:val="22"/>
+        </w:rPr>
+        <w:t xml:space="preserve"> (not a global </w:t>
+      </w:r>
+      <w:proofErr w:type="gramStart"/>
+      <w:r>
+        <w:rPr>
+          <w:szCs w:val="22"/>
+        </w:rPr>
+        <w:t>mean</w:t>
+      </w:r>
+      <w:proofErr w:type="gramEnd"/>
+      <w:r>
+        <w:rPr>
+          <w:szCs w:val="22"/>
+        </w:rPr>
+        <w:t>), to preserve city-to-city variation rather than smoothing it away.</w:t>
       </w:r>
     </w:p>
     <w:p>
@@ -961,6 +1015,7 @@
           <w:bCs/>
           <w:szCs w:val="22"/>
         </w:rPr>
+        <w:lastRenderedPageBreak/>
         <w:t>No real-world holdout</w:t>
       </w:r>
       <w:r>
@@ -1018,14 +1073,7 @@
         <w:rPr>
           <w:szCs w:val="22"/>
         </w:rPr>
-        <w:t xml:space="preserve">) confirms the agent pipeline doesn't corrupt the model's </w:t>
-      </w:r>
-      <w:r>
-        <w:rPr>
-          <w:szCs w:val="22"/>
-        </w:rPr>
-        <w:lastRenderedPageBreak/>
-        <w:t>numbers in transit</w:t>
+        <w:t>) confirms the agent pipeline doesn't corrupt the model's numbers in transit</w:t>
       </w:r>
       <w:r>
         <w:rPr>
@@ -1274,6 +1322,7 @@
         <w:t xml:space="preserve"> with </w:t>
       </w:r>
       <w:proofErr w:type="spellStart"/>
+      <w:proofErr w:type="gramStart"/>
       <w:r>
         <w:rPr>
           <w:szCs w:val="22"/>
@@ -1281,6 +1330,7 @@
         <w:t>rasterio.mask</w:t>
       </w:r>
       <w:proofErr w:type="spellEnd"/>
+      <w:proofErr w:type="gramEnd"/>
       <w:r>
         <w:rPr>
           <w:szCs w:val="22"/>
@@ -1324,7 +1374,21 @@
         <w:rPr>
           <w:szCs w:val="22"/>
         </w:rPr>
-        <w:t>missing daily weather values are filled using each city's own mean first, falling back to the global mean only when a city has zero non-null values for a column (done before aggregation</w:t>
+        <w:t xml:space="preserve">missing daily weather values are filled using each city's own </w:t>
+      </w:r>
+      <w:proofErr w:type="gramStart"/>
+      <w:r>
+        <w:rPr>
+          <w:szCs w:val="22"/>
+        </w:rPr>
+        <w:t>mean</w:t>
+      </w:r>
+      <w:proofErr w:type="gramEnd"/>
+      <w:r>
+        <w:rPr>
+          <w:szCs w:val="22"/>
+        </w:rPr>
+        <w:t xml:space="preserve"> first, falling back to the global mean only when a city has zero non-null values for a column (done before aggregation</w:t>
       </w:r>
       <w:r>
         <w:rPr>
@@ -1454,9 +1518,14 @@
       </w:r>
       <w:proofErr w:type="spellStart"/>
       <w:r>
-        <w:t>weather_data_eda.ipynb</w:t>
+        <w:t>weather_data_</w:t>
+      </w:r>
+      <w:proofErr w:type="gramStart"/>
+      <w:r>
+        <w:t>eda.ipynb</w:t>
       </w:r>
       <w:proofErr w:type="spellEnd"/>
+      <w:proofErr w:type="gramEnd"/>
       <w:r>
         <w:t>).</w:t>
       </w:r>
@@ -1472,6 +1541,7 @@
     </w:p>
     <w:p>
       <w:r>
+        <w:lastRenderedPageBreak/>
         <w:t>Column-level missingness was checked first, since it directly determines whether mean imputation is defensible at all for a given feature:</w:t>
       </w:r>
     </w:p>
@@ -1656,7 +1726,6 @@
                 <w:sz w:val="20"/>
                 <w:szCs w:val="20"/>
               </w:rPr>
-              <w:lastRenderedPageBreak/>
               <w:t>Cloud3pm</w:t>
             </w:r>
           </w:p>
@@ -1976,7 +2045,15 @@
         <w:t>. S</w:t>
       </w:r>
       <w:r>
-        <w:t xml:space="preserve">everal cities are missing a given feature entirely (100% missing for that city), which a global mean would silently paper over. </w:t>
+        <w:t xml:space="preserve">everal cities are missing a given feature entirely (100% missing for that city), which a global </w:t>
+      </w:r>
+      <w:proofErr w:type="gramStart"/>
+      <w:r>
+        <w:t>mean</w:t>
+      </w:r>
+      <w:proofErr w:type="gramEnd"/>
+      <w:r>
+        <w:t xml:space="preserve"> would silently paper over. </w:t>
       </w:r>
     </w:p>
     <w:p>
@@ -2334,6 +2411,7 @@
           <w:b/>
           <w:bCs/>
         </w:rPr>
+        <w:lastRenderedPageBreak/>
         <w:t>Dropped for weak correlation:</w:t>
       </w:r>
       <w:r>
@@ -2411,11 +2489,18 @@
           <w:b/>
           <w:bCs/>
         </w:rPr>
-        <w:lastRenderedPageBreak/>
         <w:t>33 candidate features</w:t>
       </w:r>
       <w:r>
-        <w:t xml:space="preserve"> is still far too many relative to a sample of 2</w:t>
+        <w:t xml:space="preserve"> </w:t>
+      </w:r>
+      <w:proofErr w:type="gramStart"/>
+      <w:r>
+        <w:t>is</w:t>
+      </w:r>
+      <w:proofErr w:type="gramEnd"/>
+      <w:r>
+        <w:t xml:space="preserve"> still far too many relative to a sample of 2</w:t>
       </w:r>
       <w:r>
         <w:t>7</w:t>
@@ -2473,8 +2558,13 @@
         <w:t>applied domain knowledge</w:t>
       </w:r>
       <w:r>
-        <w:t xml:space="preserve"> (physical relevance to solar output) and the sample-size constraint to narrow this down to 6 feature</w:t>
-      </w:r>
+        <w:t xml:space="preserve"> (physical relevance to solar output) and the sample-size constraint to narrow this down to 6 </w:t>
+      </w:r>
+      <w:proofErr w:type="gramStart"/>
+      <w:r>
+        <w:t>feature</w:t>
+      </w:r>
+      <w:proofErr w:type="gramEnd"/>
       <w:r>
         <w:t>.</w:t>
       </w:r>
@@ -2528,6 +2618,7 @@
     <w:p>
       <w:pPr>
         <w:pStyle w:val="Heading2"/>
+        <w:ind w:firstLine="720"/>
       </w:pPr>
       <w:r>
         <w:t>4.</w:t>
@@ -3880,6 +3971,7 @@
                 <w:sz w:val="20"/>
                 <w:szCs w:val="20"/>
               </w:rPr>
+              <w:lastRenderedPageBreak/>
               <w:t>Random Forest</w:t>
             </w:r>
           </w:p>
@@ -4166,7 +4258,6 @@
         <w:rPr>
           <w:szCs w:val="22"/>
         </w:rPr>
-        <w:lastRenderedPageBreak/>
         <w:t>It beats the baseline and is competitive with the best RMSE, without the overfitting risk tree-based models carry at n</w:t>
       </w:r>
       <w:r>
@@ -4407,7 +4498,21 @@
         <w:rPr>
           <w:szCs w:val="22"/>
         </w:rPr>
-        <w:t xml:space="preserve"> was run as a secondary check on the same data to confirm which of these features the model actually relies on, rather than trusting the chosen set uncritically.</w:t>
+        <w:t xml:space="preserve"> was run as a secondary check on the same data to confirm which of these features the model </w:t>
+      </w:r>
+      <w:proofErr w:type="gramStart"/>
+      <w:r>
+        <w:rPr>
+          <w:szCs w:val="22"/>
+        </w:rPr>
+        <w:t>actually relies</w:t>
+      </w:r>
+      <w:proofErr w:type="gramEnd"/>
+      <w:r>
+        <w:rPr>
+          <w:szCs w:val="22"/>
+        </w:rPr>
+        <w:t xml:space="preserve"> on, rather than trusting the chosen set uncritically.</w:t>
       </w:r>
     </w:p>
     <w:p>
@@ -5001,6 +5106,7 @@
                 <w:sz w:val="20"/>
                 <w:szCs w:val="20"/>
               </w:rPr>
+              <w:lastRenderedPageBreak/>
               <w:t>Descriptive Stats</w:t>
             </w:r>
           </w:p>
@@ -5053,14 +5159,7 @@
         <w:rPr>
           <w:szCs w:val="22"/>
         </w:rPr>
-        <w:t xml:space="preserve">Two resilience details are built into this flow: (1) every user-supplied or modified feature value is checked against the model's observed training range and flagged if it extrapolates, and (2) if the LLM </w:t>
-      </w:r>
-      <w:r>
-        <w:rPr>
-          <w:szCs w:val="22"/>
-        </w:rPr>
-        <w:lastRenderedPageBreak/>
-        <w:t>server is unreachable, both parsing and phrasing degrade gracefully to deterministic fallbacks rather than the agent failing outright.</w:t>
+        <w:t>Two resilience details are built into this flow: (1) every user-supplied or modified feature value is checked against the model's observed training range and flagged if it extrapolates, and (2) if the LLM server is unreachable, both parsing and phrasing degrade gracefully to deterministic fallbacks rather than the agent failing outright.</w:t>
       </w:r>
     </w:p>
     <w:p>
@@ -5208,9 +5307,20 @@
                 <w:sz w:val="16"/>
                 <w:szCs w:val="16"/>
               </w:rPr>
-              <w:t>Valid city names: {</w:t>
+              <w:t xml:space="preserve">Valid city </w:t>
+            </w:r>
+            <w:proofErr w:type="gramStart"/>
+            <w:r>
+              <w:rPr>
+                <w:rFonts w:ascii="Courier New" w:eastAsia="Courier New" w:hAnsi="Courier New" w:cs="Courier New"/>
+                <w:color w:val="222222"/>
+                <w:sz w:val="16"/>
+                <w:szCs w:val="16"/>
+              </w:rPr>
+              <w:t>names: {</w:t>
             </w:r>
             <w:proofErr w:type="spellStart"/>
+            <w:proofErr w:type="gramEnd"/>
             <w:r>
               <w:rPr>
                 <w:rFonts w:ascii="Courier New" w:eastAsia="Courier New" w:hAnsi="Courier New" w:cs="Courier New"/>
@@ -5218,7 +5328,17 @@
                 <w:sz w:val="16"/>
                 <w:szCs w:val="16"/>
               </w:rPr>
-              <w:t>city_list_str</w:t>
+              <w:t>city_list_</w:t>
+            </w:r>
+            <w:proofErr w:type="gramStart"/>
+            <w:r>
+              <w:rPr>
+                <w:rFonts w:ascii="Courier New" w:eastAsia="Courier New" w:hAnsi="Courier New" w:cs="Courier New"/>
+                <w:color w:val="222222"/>
+                <w:sz w:val="16"/>
+                <w:szCs w:val="16"/>
+              </w:rPr>
+              <w:t>str</w:t>
             </w:r>
             <w:proofErr w:type="spellEnd"/>
             <w:r>
@@ -5230,6 +5350,7 @@
               </w:rPr>
               <w:t>}.</w:t>
             </w:r>
+            <w:proofErr w:type="gramEnd"/>
           </w:p>
           <w:p>
             <w:pPr>
@@ -5301,6 +5422,7 @@
                 <w:szCs w:val="16"/>
               </w:rPr>
             </w:pPr>
+            <w:proofErr w:type="gramStart"/>
             <w:r>
               <w:rPr>
                 <w:rFonts w:ascii="Courier New" w:eastAsia="Courier New" w:hAnsi="Courier New" w:cs="Courier New"/>
@@ -5308,7 +5430,17 @@
                 <w:sz w:val="16"/>
                 <w:szCs w:val="16"/>
               </w:rPr>
-              <w:t>it doesn't match any of these, use the city name exactly as the user stated it -- do not invent</w:t>
+              <w:t>it</w:t>
+            </w:r>
+            <w:proofErr w:type="gramEnd"/>
+            <w:r>
+              <w:rPr>
+                <w:rFonts w:ascii="Courier New" w:eastAsia="Courier New" w:hAnsi="Courier New" w:cs="Courier New"/>
+                <w:color w:val="222222"/>
+                <w:sz w:val="16"/>
+                <w:szCs w:val="16"/>
+              </w:rPr>
+              <w:t xml:space="preserve"> doesn't match any of these, use the city name exactly as the user stated it -- do not invent</w:t>
             </w:r>
           </w:p>
           <w:p>
@@ -5430,8 +5562,19 @@
                 <w:sz w:val="16"/>
                 <w:szCs w:val="16"/>
               </w:rPr>
-              <w:t>2. Weather-conditioned query (the user gives specific expected weather, e.g. "given Sunshine</w:t>
-            </w:r>
+              <w:t xml:space="preserve">2. Weather-conditioned query (the user gives specific expected weather, e.g. "given </w:t>
+            </w:r>
+            <w:proofErr w:type="gramStart"/>
+            <w:r>
+              <w:rPr>
+                <w:rFonts w:ascii="Courier New" w:eastAsia="Courier New" w:hAnsi="Courier New" w:cs="Courier New"/>
+                <w:color w:val="222222"/>
+                <w:sz w:val="16"/>
+                <w:szCs w:val="16"/>
+              </w:rPr>
+              <w:t>Sunshine</w:t>
+            </w:r>
+            <w:proofErr w:type="gramEnd"/>
           </w:p>
           <w:p>
             <w:pPr>
@@ -5530,7 +5673,67 @@
                 <w:sz w:val="16"/>
                 <w:szCs w:val="16"/>
               </w:rPr>
-              <w:t xml:space="preserve">   Valid weather feature names: {", ".join(KNOWN_WEATHER_FEATURES)}.</w:t>
+              <w:t xml:space="preserve">   Valid weather feature </w:t>
+            </w:r>
+            <w:proofErr w:type="gramStart"/>
+            <w:r>
+              <w:rPr>
+                <w:rFonts w:ascii="Courier New" w:eastAsia="Courier New" w:hAnsi="Courier New" w:cs="Courier New"/>
+                <w:color w:val="222222"/>
+                <w:sz w:val="16"/>
+                <w:szCs w:val="16"/>
+              </w:rPr>
+              <w:t>names: {</w:t>
+            </w:r>
+            <w:proofErr w:type="gramEnd"/>
+            <w:r>
+              <w:rPr>
+                <w:rFonts w:ascii="Courier New" w:eastAsia="Courier New" w:hAnsi="Courier New" w:cs="Courier New"/>
+                <w:color w:val="222222"/>
+                <w:sz w:val="16"/>
+                <w:szCs w:val="16"/>
+              </w:rPr>
+              <w:t xml:space="preserve">", </w:t>
+            </w:r>
+            <w:proofErr w:type="gramStart"/>
+            <w:r>
+              <w:rPr>
+                <w:rFonts w:ascii="Courier New" w:eastAsia="Courier New" w:hAnsi="Courier New" w:cs="Courier New"/>
+                <w:color w:val="222222"/>
+                <w:sz w:val="16"/>
+                <w:szCs w:val="16"/>
+              </w:rPr>
+              <w:t>".join</w:t>
+            </w:r>
+            <w:proofErr w:type="gramEnd"/>
+            <w:r>
+              <w:rPr>
+                <w:rFonts w:ascii="Courier New" w:eastAsia="Courier New" w:hAnsi="Courier New" w:cs="Courier New"/>
+                <w:color w:val="222222"/>
+                <w:sz w:val="16"/>
+                <w:szCs w:val="16"/>
+              </w:rPr>
+              <w:t>(KNOWN_WEATHER_</w:t>
+            </w:r>
+            <w:proofErr w:type="gramStart"/>
+            <w:r>
+              <w:rPr>
+                <w:rFonts w:ascii="Courier New" w:eastAsia="Courier New" w:hAnsi="Courier New" w:cs="Courier New"/>
+                <w:color w:val="222222"/>
+                <w:sz w:val="16"/>
+                <w:szCs w:val="16"/>
+              </w:rPr>
+              <w:t>FEATURES)}</w:t>
+            </w:r>
+            <w:proofErr w:type="gramEnd"/>
+            <w:r>
+              <w:rPr>
+                <w:rFonts w:ascii="Courier New" w:eastAsia="Courier New" w:hAnsi="Courier New" w:cs="Courier New"/>
+                <w:color w:val="222222"/>
+                <w:sz w:val="16"/>
+                <w:szCs w:val="16"/>
+              </w:rPr>
+              <w:t>.</w:t>
             </w:r>
           </w:p>
           <w:p>
@@ -5550,7 +5753,27 @@
                 <w:sz w:val="16"/>
                 <w:szCs w:val="16"/>
               </w:rPr>
-              <w:t xml:space="preserve">   Only include features the user actually specified values for.</w:t>
+              <w:t xml:space="preserve">   Only include features the user </w:t>
+            </w:r>
+            <w:proofErr w:type="gramStart"/>
+            <w:r>
+              <w:rPr>
+                <w:rFonts w:ascii="Courier New" w:eastAsia="Courier New" w:hAnsi="Courier New" w:cs="Courier New"/>
+                <w:color w:val="222222"/>
+                <w:sz w:val="16"/>
+                <w:szCs w:val="16"/>
+              </w:rPr>
+              <w:t>actually specified</w:t>
+            </w:r>
+            <w:proofErr w:type="gramEnd"/>
+            <w:r>
+              <w:rPr>
+                <w:rFonts w:ascii="Courier New" w:eastAsia="Courier New" w:hAnsi="Courier New" w:cs="Courier New"/>
+                <w:color w:val="222222"/>
+                <w:sz w:val="16"/>
+                <w:szCs w:val="16"/>
+              </w:rPr>
+              <w:t xml:space="preserve"> values for.</w:t>
             </w:r>
           </w:p>
           <w:p>
@@ -5692,8 +5915,19 @@
                 <w:sz w:val="16"/>
                 <w:szCs w:val="16"/>
               </w:rPr>
-              <w:t>", "cities": ["&lt;city1&gt;", "&lt;city2&gt;", ...]}}</w:t>
-            </w:r>
+              <w:t xml:space="preserve">", "cities": ["&lt;city1&gt;", "&lt;city2&gt;", </w:t>
+            </w:r>
+            <w:proofErr w:type="gramStart"/>
+            <w:r>
+              <w:rPr>
+                <w:rFonts w:ascii="Courier New" w:eastAsia="Courier New" w:hAnsi="Courier New" w:cs="Courier New"/>
+                <w:color w:val="222222"/>
+                <w:sz w:val="16"/>
+                <w:szCs w:val="16"/>
+              </w:rPr>
+              <w:t>...]}}</w:t>
+            </w:r>
+            <w:proofErr w:type="gramEnd"/>
           </w:p>
           <w:p>
             <w:pPr>
@@ -5743,7 +5977,27 @@
                 <w:sz w:val="16"/>
                 <w:szCs w:val="16"/>
               </w:rPr>
-              <w:t xml:space="preserve">   this is for questions about </w:t>
+              <w:t xml:space="preserve">   </w:t>
+            </w:r>
+            <w:proofErr w:type="gramStart"/>
+            <w:r>
+              <w:rPr>
+                <w:rFonts w:ascii="Courier New" w:eastAsia="Courier New" w:hAnsi="Courier New" w:cs="Courier New"/>
+                <w:color w:val="222222"/>
+                <w:sz w:val="16"/>
+                <w:szCs w:val="16"/>
+              </w:rPr>
+              <w:t>this</w:t>
+            </w:r>
+            <w:proofErr w:type="gramEnd"/>
+            <w:r>
+              <w:rPr>
+                <w:rFonts w:ascii="Courier New" w:eastAsia="Courier New" w:hAnsi="Courier New" w:cs="Courier New"/>
+                <w:color w:val="222222"/>
+                <w:sz w:val="16"/>
+                <w:szCs w:val="16"/>
+              </w:rPr>
+              <w:t xml:space="preserve"> is for questions about </w:t>
             </w:r>
             <w:proofErr w:type="spellStart"/>
             <w:r>
@@ -5974,8 +6228,19 @@
                 <w:sz w:val="16"/>
                 <w:szCs w:val="16"/>
               </w:rPr>
-              <w:t xml:space="preserve">   {{"intent": "unknown"}}</w:t>
-            </w:r>
+              <w:t xml:space="preserve">   {{"intent": "</w:t>
+            </w:r>
+            <w:proofErr w:type="gramStart"/>
+            <w:r>
+              <w:rPr>
+                <w:rFonts w:ascii="Courier New" w:eastAsia="Courier New" w:hAnsi="Courier New" w:cs="Courier New"/>
+                <w:color w:val="222222"/>
+                <w:sz w:val="16"/>
+                <w:szCs w:val="16"/>
+              </w:rPr>
+              <w:t>unknown"}}</w:t>
+            </w:r>
+            <w:proofErr w:type="gramEnd"/>
           </w:p>
           <w:p>
             <w:pPr>
@@ -6022,6 +6287,7 @@
           <w:iCs/>
           <w:szCs w:val="22"/>
         </w:rPr>
+        <w:lastRenderedPageBreak/>
         <w:t xml:space="preserve">Full implementation: </w:t>
       </w:r>
       <w:r>
@@ -6056,7 +6322,6 @@
         <w:pStyle w:val="Heading1"/>
       </w:pPr>
       <w:r>
-        <w:lastRenderedPageBreak/>
         <w:t>5. Results, Discussion</w:t>
       </w:r>
       <w:r>
@@ -7104,7 +7369,7 @@
         </w:rPr>
         <w:t xml:space="preserve">-tier agent evaluation strategy follows the structure described in </w:t>
       </w:r>
-      <w:hyperlink r:id="rId5" w:history="1">
+      <w:hyperlink r:id="rId7" w:history="1">
         <w:proofErr w:type="spellStart"/>
         <w:r>
           <w:rPr>
@@ -7151,6 +7416,7 @@
         <w:pStyle w:val="Heading2"/>
       </w:pPr>
       <w:r>
+        <w:lastRenderedPageBreak/>
         <w:t>5.3 Discussion</w:t>
       </w:r>
     </w:p>
@@ -7274,7 +7540,6 @@
         <w:rPr>
           <w:szCs w:val="22"/>
         </w:rPr>
-        <w:lastRenderedPageBreak/>
         <w:t>The LLM-unreachable fallback path (rule-based parsing + templated answers) is a real resilience feature</w:t>
       </w:r>
       <w:r>
@@ -7490,7 +7755,7 @@
           <w:szCs w:val="22"/>
         </w:rPr>
       </w:pPr>
-      <w:hyperlink r:id="rId6" w:history="1">
+      <w:hyperlink r:id="rId8" w:history="1">
         <w:r>
           <w:rPr>
             <w:rStyle w:val="Hyperlink"/>
@@ -7526,7 +7791,7 @@
           <w:szCs w:val="22"/>
         </w:rPr>
       </w:pPr>
-      <w:hyperlink r:id="rId7" w:history="1">
+      <w:hyperlink r:id="rId9" w:history="1">
         <w:r>
           <w:rPr>
             <w:rStyle w:val="Hyperlink"/>
@@ -7602,6 +7867,7 @@
         <w:t>raster I/O, reprojection, masking (</w:t>
       </w:r>
       <w:proofErr w:type="spellStart"/>
+      <w:proofErr w:type="gramStart"/>
       <w:r>
         <w:rPr>
           <w:szCs w:val="22"/>
@@ -7609,6 +7875,7 @@
         <w:t>rasterio.mask</w:t>
       </w:r>
       <w:proofErr w:type="spellEnd"/>
+      <w:proofErr w:type="gramEnd"/>
       <w:r>
         <w:rPr>
           <w:szCs w:val="22"/>
@@ -7696,6 +7963,7 @@
           <w:bCs/>
           <w:szCs w:val="22"/>
         </w:rPr>
+        <w:lastRenderedPageBreak/>
         <w:t>geopy</w:t>
       </w:r>
       <w:proofErr w:type="spellEnd"/>
@@ -8095,7 +8363,25 @@
                 <w:sz w:val="16"/>
                 <w:szCs w:val="16"/>
               </w:rPr>
-              <w:t>|   |-- Weather Training Data.csv  # Kaggle Australia weather dataset</w:t>
+              <w:t xml:space="preserve">|   |-- Weather Training </w:t>
+            </w:r>
+            <w:proofErr w:type="gramStart"/>
+            <w:r>
+              <w:rPr>
+                <w:rFonts w:ascii="Courier New" w:eastAsia="Courier New" w:hAnsi="Courier New" w:cs="Courier New"/>
+                <w:sz w:val="16"/>
+                <w:szCs w:val="16"/>
+              </w:rPr>
+              <w:t>Data.csv  #</w:t>
+            </w:r>
+            <w:proofErr w:type="gramEnd"/>
+            <w:r>
+              <w:rPr>
+                <w:rFonts w:ascii="Courier New" w:eastAsia="Courier New" w:hAnsi="Courier New" w:cs="Courier New"/>
+                <w:sz w:val="16"/>
+                <w:szCs w:val="16"/>
+              </w:rPr>
+              <w:t xml:space="preserve"> Kaggle Australia weather dataset</w:t>
             </w:r>
           </w:p>
           <w:p>
@@ -8261,7 +8547,25 @@
                 <w:sz w:val="16"/>
                 <w:szCs w:val="16"/>
               </w:rPr>
-              <w:t>|-- output/                        # generated at runtime; not committed</w:t>
+              <w:t xml:space="preserve">|-- </w:t>
+            </w:r>
+            <w:proofErr w:type="gramStart"/>
+            <w:r>
+              <w:rPr>
+                <w:rFonts w:ascii="Courier New" w:eastAsia="Courier New" w:hAnsi="Courier New" w:cs="Courier New"/>
+                <w:sz w:val="16"/>
+                <w:szCs w:val="16"/>
+              </w:rPr>
+              <w:t>output/                        #</w:t>
+            </w:r>
+            <w:proofErr w:type="gramEnd"/>
+            <w:r>
+              <w:rPr>
+                <w:rFonts w:ascii="Courier New" w:eastAsia="Courier New" w:hAnsi="Courier New" w:cs="Courier New"/>
+                <w:sz w:val="16"/>
+                <w:szCs w:val="16"/>
+              </w:rPr>
+              <w:t xml:space="preserve"> generated at runtime; not committed</w:t>
             </w:r>
           </w:p>
           <w:p>
@@ -8309,9 +8613,19 @@
                 <w:sz w:val="16"/>
                 <w:szCs w:val="16"/>
               </w:rPr>
-              <w:t>solar_model.joblib</w:t>
+              <w:t>solar_</w:t>
+            </w:r>
+            <w:proofErr w:type="gramStart"/>
+            <w:r>
+              <w:rPr>
+                <w:rFonts w:ascii="Courier New" w:eastAsia="Courier New" w:hAnsi="Courier New" w:cs="Courier New"/>
+                <w:sz w:val="16"/>
+                <w:szCs w:val="16"/>
+              </w:rPr>
+              <w:t>model.joblib</w:t>
             </w:r>
             <w:proofErr w:type="spellEnd"/>
+            <w:proofErr w:type="gramEnd"/>
           </w:p>
           <w:p>
             <w:pPr>
@@ -8332,9 +8646,19 @@
                 <w:sz w:val="16"/>
                 <w:szCs w:val="16"/>
               </w:rPr>
-              <w:t>feature_ranges.json</w:t>
+              <w:t>feature_</w:t>
+            </w:r>
+            <w:proofErr w:type="gramStart"/>
+            <w:r>
+              <w:rPr>
+                <w:rFonts w:ascii="Courier New" w:eastAsia="Courier New" w:hAnsi="Courier New" w:cs="Courier New"/>
+                <w:sz w:val="16"/>
+                <w:szCs w:val="16"/>
+              </w:rPr>
+              <w:t>ranges.json</w:t>
             </w:r>
             <w:proofErr w:type="spellEnd"/>
+            <w:proofErr w:type="gramEnd"/>
           </w:p>
           <w:p>
             <w:pPr>
@@ -8622,7 +8946,23 @@
                 <w:sz w:val="20"/>
                 <w:szCs w:val="20"/>
               </w:rPr>
-              <w:t xml:space="preserve"> small generated cache files. Large/raw files are </w:t>
+              <w:t xml:space="preserve"> </w:t>
+            </w:r>
+            <w:proofErr w:type="gramStart"/>
+            <w:r>
+              <w:rPr>
+                <w:sz w:val="20"/>
+                <w:szCs w:val="20"/>
+              </w:rPr>
+              <w:t>small generated</w:t>
+            </w:r>
+            <w:proofErr w:type="gramEnd"/>
+            <w:r>
+              <w:rPr>
+                <w:sz w:val="20"/>
+                <w:szCs w:val="20"/>
+              </w:rPr>
+              <w:t xml:space="preserve"> cache files. Large/raw files are </w:t>
             </w:r>
             <w:proofErr w:type="spellStart"/>
             <w:r>
@@ -8677,6 +9017,7 @@
                 <w:sz w:val="20"/>
                 <w:szCs w:val="20"/>
               </w:rPr>
+              <w:lastRenderedPageBreak/>
               <w:t>src</w:t>
             </w:r>
             <w:proofErr w:type="spellEnd"/>
@@ -8998,7 +9339,6 @@
                 <w:sz w:val="20"/>
                 <w:szCs w:val="20"/>
               </w:rPr>
-              <w:lastRenderedPageBreak/>
               <w:t>README.md</w:t>
             </w:r>
           </w:p>
@@ -12957,4 +13297,16 @@
     </a:ext>
   </a:extLst>
 </a:theme>
+</file>
+
+<file path=customXml/item1.xml><?xml version="1.0" encoding="utf-8"?>
+<b:Sources xmlns:b="http://schemas.openxmlformats.org/officeDocument/2006/bibliography" xmlns="http://schemas.openxmlformats.org/officeDocument/2006/bibliography" SelectedStyle="\APASixthEditionOfficeOnline.xsl" StyleName="APA" Version="6"/>
+</file>
+
+<file path=customXml/itemProps1.xml><?xml version="1.0" encoding="utf-8"?>
+<ds:datastoreItem xmlns:ds="http://schemas.openxmlformats.org/officeDocument/2006/customXml" ds:itemID="{6D218D0F-F851-46BA-AD4F-C42E111687C2}">
+  <ds:schemaRefs>
+    <ds:schemaRef ds:uri="http://schemas.openxmlformats.org/officeDocument/2006/bibliography"/>
+  </ds:schemaRefs>
+</ds:datastoreItem>
 </file>
</xml_diff>